<commit_message>
fix: Change color scheme from pink to professional indigo/blue
Replace pink (#ec4899) palette with indigo (#4f63d2) and sky blue
(#0ea5e9) accent for a more professional appearance across site,
CV HTML, PDF, and DOCX.
</commit_message>
<xml_diff>
--- a/CV Ana-Maria Verbnii.docx
+++ b/CV Ana-Maria Verbnii.docx
@@ -68,7 +68,7 @@
             <w:r>
               <w:rPr>
                 <w:b/>
-                <w:color w:val="F472B6"/>
+                <w:color w:val="4F63D2"/>
                 <w:sz w:val="20"/>
               </w:rPr>
               <w:t>CONTACTO</w:t>
@@ -127,7 +127,7 @@
             <w:r>
               <w:rPr>
                 <w:b/>
-                <w:color w:val="F472B6"/>
+                <w:color w:val="4F63D2"/>
                 <w:sz w:val="20"/>
               </w:rPr>
               <w:t>COMPETÊNCIAS</w:t>
@@ -226,7 +226,7 @@
             <w:r>
               <w:rPr>
                 <w:b/>
-                <w:color w:val="F472B6"/>
+                <w:color w:val="4F63D2"/>
                 <w:sz w:val="20"/>
               </w:rPr>
               <w:t>IDIOMAS</w:t>
@@ -365,7 +365,7 @@
             <w:r>
               <w:rPr>
                 <w:b/>
-                <w:color w:val="F472B6"/>
+                <w:color w:val="4F63D2"/>
                 <w:sz w:val="20"/>
               </w:rPr>
               <w:t>CERTIFICAÇÕES</w:t>
@@ -423,7 +423,7 @@
           <w:p>
             <w:r>
               <w:rPr>
-                <w:color w:val="F472B6"/>
+                <w:color w:val="4F63D2"/>
                 <w:sz w:val="8"/>
               </w:rPr>
               <w:t>━━━━━━━━━━━━━━━━━━━━━━━━━━━━━━━━━━━━━━━━━━━━━━━━━━━━━━━</w:t>
@@ -504,7 +504,7 @@
             <w:r>
               <w:rPr>
                 <w:b/>
-                <w:color w:val="F472B6"/>
+                <w:color w:val="4F63D2"/>
                 <w:sz w:val="17"/>
               </w:rPr>
               <w:t>Iberglobal powered by MCA</w:t>
@@ -554,7 +554,7 @@
             <w:r>
               <w:rPr>
                 <w:b/>
-                <w:color w:val="F472B6"/>
+                <w:color w:val="4F63D2"/>
                 <w:sz w:val="17"/>
               </w:rPr>
               <w:t>PowerYield</w:t>
@@ -604,7 +604,7 @@
             <w:r>
               <w:rPr>
                 <w:b/>
-                <w:color w:val="F472B6"/>
+                <w:color w:val="4F63D2"/>
                 <w:sz w:val="17"/>
               </w:rPr>
               <w:t>PowerYield</w:t>
@@ -654,7 +654,7 @@
             <w:r>
               <w:rPr>
                 <w:b/>
-                <w:color w:val="F472B6"/>
+                <w:color w:val="4F63D2"/>
                 <w:sz w:val="17"/>
               </w:rPr>
               <w:t>Agrovisul</w:t>
@@ -704,7 +704,7 @@
             <w:r>
               <w:rPr>
                 <w:b/>
-                <w:color w:val="F472B6"/>
+                <w:color w:val="4F63D2"/>
                 <w:sz w:val="17"/>
               </w:rPr>
               <w:t>Casa Relvas</w:t>
@@ -754,7 +754,7 @@
             <w:r>
               <w:rPr>
                 <w:b/>
-                <w:color w:val="F472B6"/>
+                <w:color w:val="4F63D2"/>
                 <w:sz w:val="17"/>
               </w:rPr>
               <w:t>Évora Hotel</w:t>
@@ -804,7 +804,7 @@
             <w:r>
               <w:rPr>
                 <w:b/>
-                <w:color w:val="F472B6"/>
+                <w:color w:val="4F63D2"/>
                 <w:sz w:val="17"/>
               </w:rPr>
               <w:t>M'AR De AR Hotels</w:t>
@@ -850,7 +850,7 @@
             <w:r>
               <w:rPr>
                 <w:b/>
-                <w:color w:val="F472B6"/>
+                <w:color w:val="4F63D2"/>
                 <w:sz w:val="17"/>
               </w:rPr>
               <w:t>Curso Técnico de Turismo e Hotelaria</w:t>
@@ -877,7 +877,7 @@
             <w:r>
               <w:rPr>
                 <w:b/>
-                <w:color w:val="F472B6"/>
+                <w:color w:val="4F63D2"/>
                 <w:sz w:val="17"/>
               </w:rPr>
               <w:t>Ensino Secundário</w:t>

</xml_diff>

<commit_message>
feat: Add Cegid Primavera, SAP, New Hotel, WiseCrop, TOC Online to skills
</commit_message>
<xml_diff>
--- a/CV Ana-Maria Verbnii.docx
+++ b/CV Ana-Maria Verbnii.docx
@@ -200,6 +200,56 @@
                 <w:sz w:val="15"/>
               </w:rPr>
               <w:t>▸ Microsoft Office (Excel, Word)</w:t>
+            </w:r>
+          </w:p>
+          <w:p>
+            <w:r>
+              <w:rPr>
+                <w:b w:val="0"/>
+                <w:color w:val="CBD5E0"/>
+                <w:sz w:val="15"/>
+              </w:rPr>
+              <w:t>▸ Cegid Primavera</w:t>
+            </w:r>
+          </w:p>
+          <w:p>
+            <w:r>
+              <w:rPr>
+                <w:b w:val="0"/>
+                <w:color w:val="CBD5E0"/>
+                <w:sz w:val="15"/>
+              </w:rPr>
+              <w:t>▸ SAP Business One</w:t>
+            </w:r>
+          </w:p>
+          <w:p>
+            <w:r>
+              <w:rPr>
+                <w:b w:val="0"/>
+                <w:color w:val="CBD5E0"/>
+                <w:sz w:val="15"/>
+              </w:rPr>
+              <w:t>▸ New Hotel</w:t>
+            </w:r>
+          </w:p>
+          <w:p>
+            <w:r>
+              <w:rPr>
+                <w:b w:val="0"/>
+                <w:color w:val="CBD5E0"/>
+                <w:sz w:val="15"/>
+              </w:rPr>
+              <w:t>▸ WiseCrop</w:t>
+            </w:r>
+          </w:p>
+          <w:p>
+            <w:r>
+              <w:rPr>
+                <w:b w:val="0"/>
+                <w:color w:val="CBD5E0"/>
+                <w:sz w:val="15"/>
+              </w:rPr>
+              <w:t>▸ TOC Online</w:t>
             </w:r>
           </w:p>
           <w:p>

</xml_diff>

<commit_message>
fix: Reorder software skills - Primavera, SAP, TOC Online first
</commit_message>
<xml_diff>
--- a/CV Ana-Maria Verbnii.docx
+++ b/CV Ana-Maria Verbnii.docx
@@ -199,16 +199,6 @@
                 <w:color w:val="CBD5E0"/>
                 <w:sz w:val="15"/>
               </w:rPr>
-              <w:t>▸ Microsoft Office (Excel, Word)</w:t>
-            </w:r>
-          </w:p>
-          <w:p>
-            <w:r>
-              <w:rPr>
-                <w:b w:val="0"/>
-                <w:color w:val="CBD5E0"/>
-                <w:sz w:val="15"/>
-              </w:rPr>
               <w:t>▸ Cegid Primavera</w:t>
             </w:r>
           </w:p>
@@ -229,6 +219,26 @@
                 <w:color w:val="CBD5E0"/>
                 <w:sz w:val="15"/>
               </w:rPr>
+              <w:t>▸ TOC Online</w:t>
+            </w:r>
+          </w:p>
+          <w:p>
+            <w:r>
+              <w:rPr>
+                <w:b w:val="0"/>
+                <w:color w:val="CBD5E0"/>
+                <w:sz w:val="15"/>
+              </w:rPr>
+              <w:t>▸ Microsoft Office (Excel, Word)</w:t>
+            </w:r>
+          </w:p>
+          <w:p>
+            <w:r>
+              <w:rPr>
+                <w:b w:val="0"/>
+                <w:color w:val="CBD5E0"/>
+                <w:sz w:val="15"/>
+              </w:rPr>
               <w:t>▸ New Hotel</w:t>
             </w:r>
           </w:p>
@@ -240,16 +250,6 @@
                 <w:sz w:val="15"/>
               </w:rPr>
               <w:t>▸ WiseCrop</w:t>
-            </w:r>
-          </w:p>
-          <w:p>
-            <w:r>
-              <w:rPr>
-                <w:b w:val="0"/>
-                <w:color w:val="CBD5E0"/>
-                <w:sz w:val="15"/>
-              </w:rPr>
-              <w:t>▸ TOC Online</w:t>
             </w:r>
           </w:p>
           <w:p>

</xml_diff>

<commit_message>
feat: Executive color palette (gold/slate) + company links
- New palette: gold (#96794a) primary + slate (#64708d) accent
- Company names now link to their websites
- CV updated: 9 years, vitivinícola, Russian native, no Ukrainian, RH support
</commit_message>
<xml_diff>
--- a/CV Ana-Maria Verbnii.docx
+++ b/CV Ana-Maria Verbnii.docx
@@ -68,7 +68,7 @@
             <w:r>
               <w:rPr>
                 <w:b/>
-                <w:color w:val="4F63D2"/>
+                <w:color w:val="96794A"/>
                 <w:sz w:val="20"/>
               </w:rPr>
               <w:t>CONTACTO</w:t>
@@ -127,7 +127,7 @@
             <w:r>
               <w:rPr>
                 <w:b/>
-                <w:color w:val="4F63D2"/>
+                <w:color w:val="96794A"/>
                 <w:sz w:val="20"/>
               </w:rPr>
               <w:t>COMPETÊNCIAS</w:t>
@@ -276,7 +276,7 @@
             <w:r>
               <w:rPr>
                 <w:b/>
-                <w:color w:val="4F63D2"/>
+                <w:color w:val="96794A"/>
                 <w:sz w:val="20"/>
               </w:rPr>
               <w:t>IDIOMAS</w:t>
@@ -415,7 +415,7 @@
             <w:r>
               <w:rPr>
                 <w:b/>
-                <w:color w:val="4F63D2"/>
+                <w:color w:val="96794A"/>
                 <w:sz w:val="20"/>
               </w:rPr>
               <w:t>CERTIFICAÇÕES</w:t>
@@ -473,7 +473,7 @@
           <w:p>
             <w:r>
               <w:rPr>
-                <w:color w:val="4F63D2"/>
+                <w:color w:val="96794A"/>
                 <w:sz w:val="8"/>
               </w:rPr>
               <w:t>━━━━━━━━━━━━━━━━━━━━━━━━━━━━━━━━━━━━━━━━━━━━━━━━━━━━━━━</w:t>
@@ -554,7 +554,7 @@
             <w:r>
               <w:rPr>
                 <w:b/>
-                <w:color w:val="4F63D2"/>
+                <w:color w:val="96794A"/>
                 <w:sz w:val="17"/>
               </w:rPr>
               <w:t>Iberglobal powered by MCA</w:t>
@@ -604,7 +604,7 @@
             <w:r>
               <w:rPr>
                 <w:b/>
-                <w:color w:val="4F63D2"/>
+                <w:color w:val="96794A"/>
                 <w:sz w:val="17"/>
               </w:rPr>
               <w:t>PowerYield</w:t>
@@ -654,7 +654,7 @@
             <w:r>
               <w:rPr>
                 <w:b/>
-                <w:color w:val="4F63D2"/>
+                <w:color w:val="96794A"/>
                 <w:sz w:val="17"/>
               </w:rPr>
               <w:t>PowerYield</w:t>
@@ -704,7 +704,7 @@
             <w:r>
               <w:rPr>
                 <w:b/>
-                <w:color w:val="4F63D2"/>
+                <w:color w:val="96794A"/>
                 <w:sz w:val="17"/>
               </w:rPr>
               <w:t>Agrovisul</w:t>
@@ -754,7 +754,7 @@
             <w:r>
               <w:rPr>
                 <w:b/>
-                <w:color w:val="4F63D2"/>
+                <w:color w:val="96794A"/>
                 <w:sz w:val="17"/>
               </w:rPr>
               <w:t>Casa Relvas</w:t>
@@ -804,7 +804,7 @@
             <w:r>
               <w:rPr>
                 <w:b/>
-                <w:color w:val="4F63D2"/>
+                <w:color w:val="96794A"/>
                 <w:sz w:val="17"/>
               </w:rPr>
               <w:t>Évora Hotel</w:t>
@@ -854,7 +854,7 @@
             <w:r>
               <w:rPr>
                 <w:b/>
-                <w:color w:val="4F63D2"/>
+                <w:color w:val="96794A"/>
                 <w:sz w:val="17"/>
               </w:rPr>
               <w:t>M'AR De AR Hotels</w:t>
@@ -900,7 +900,7 @@
             <w:r>
               <w:rPr>
                 <w:b/>
-                <w:color w:val="4F63D2"/>
+                <w:color w:val="96794A"/>
                 <w:sz w:val="17"/>
               </w:rPr>
               <w:t>Curso Técnico de Turismo e Hotelaria</w:t>
@@ -927,7 +927,7 @@
             <w:r>
               <w:rPr>
                 <w:b/>
-                <w:color w:val="4F63D2"/>
+                <w:color w:val="96794A"/>
                 <w:sz w:val="17"/>
               </w:rPr>
               <w:t>Ensino Secundário</w:t>

</xml_diff>

<commit_message>
chore: update Ana-Maria CV with improved styling and larger photo
</commit_message>
<xml_diff>
--- a/CV Ana-Maria Verbnii.docx
+++ b/CV Ana-Maria Verbnii.docx
@@ -14,6 +14,9 @@
         <w:gridCol w:w="5837"/>
       </w:tblGrid>
       <w:tr>
+        <w:trPr>
+          <w:trHeight w:val="14967" w:hRule="atLeast"/>
+        </w:trPr>
         <w:tc>
           <w:tcPr>
             <w:tcW w:type="dxa" w:w="3685"/>
@@ -32,7 +35,7 @@
             <w:r>
               <w:drawing>
                 <wp:inline xmlns:a="http://schemas.openxmlformats.org/drawingml/2006/main" xmlns:pic="http://schemas.openxmlformats.org/drawingml/2006/picture">
-                  <wp:extent cx="1080000" cy="1353083"/>
+                  <wp:extent cx="1512000" cy="1894316"/>
                   <wp:docPr id="1" name="Picture 1"/>
                   <wp:cNvGraphicFramePr>
                     <a:graphicFrameLocks noChangeAspect="1"/>
@@ -53,7 +56,7 @@
                         <pic:spPr>
                           <a:xfrm>
                             <a:off x="0" y="0"/>
-                            <a:ext cx="1080000" cy="1353083"/>
+                            <a:ext cx="1512000" cy="1894316"/>
                           </a:xfrm>
                           <a:prstGeom prst="rect"/>
                         </pic:spPr>
@@ -65,6 +68,9 @@
             </w:r>
           </w:p>
           <w:p>
+            <w:pPr>
+              <w:spacing w:before="160" w:after="80"/>
+            </w:pPr>
             <w:r>
               <w:rPr>
                 <w:b/>
@@ -75,6 +81,9 @@
             </w:r>
           </w:p>
           <w:p>
+            <w:pPr>
+              <w:spacing w:before="0" w:after="80"/>
+            </w:pPr>
             <w:r>
               <w:rPr>
                 <w:color w:val="4A5568"/>
@@ -84,6 +93,9 @@
             </w:r>
           </w:p>
           <w:p>
+            <w:pPr>
+              <w:spacing w:before="20" w:after="20"/>
+            </w:pPr>
             <w:r>
               <w:rPr>
                 <w:b w:val="0"/>
@@ -94,6 +106,9 @@
             </w:r>
           </w:p>
           <w:p>
+            <w:pPr>
+              <w:spacing w:before="20" w:after="20"/>
+            </w:pPr>
             <w:r>
               <w:rPr>
                 <w:b w:val="0"/>
@@ -104,6 +119,9 @@
             </w:r>
           </w:p>
           <w:p>
+            <w:pPr>
+              <w:spacing w:before="20" w:after="20"/>
+            </w:pPr>
             <w:r>
               <w:rPr>
                 <w:b w:val="0"/>
@@ -114,6 +132,9 @@
             </w:r>
           </w:p>
           <w:p>
+            <w:pPr>
+              <w:spacing w:before="20" w:after="20"/>
+            </w:pPr>
             <w:r>
               <w:rPr>
                 <w:b w:val="0"/>
@@ -124,16 +145,22 @@
             </w:r>
           </w:p>
           <w:p>
+            <w:pPr>
+              <w:spacing w:before="160" w:after="80"/>
+            </w:pPr>
             <w:r>
               <w:rPr>
                 <w:b/>
                 <w:color w:val="96794A"/>
                 <w:sz w:val="20"/>
               </w:rPr>
-              <w:t>COMPETÊNCIAS</w:t>
+              <w:t>ADMINISTRAÇÃO E FINANÇAS</w:t>
             </w:r>
           </w:p>
           <w:p>
+            <w:pPr>
+              <w:spacing w:before="0" w:after="80"/>
+            </w:pPr>
             <w:r>
               <w:rPr>
                 <w:color w:val="4A5568"/>
@@ -143,6 +170,9 @@
             </w:r>
           </w:p>
           <w:p>
+            <w:pPr>
+              <w:spacing w:before="20" w:after="20"/>
+            </w:pPr>
             <w:r>
               <w:rPr>
                 <w:b w:val="0"/>
@@ -153,16 +183,74 @@
             </w:r>
           </w:p>
           <w:p>
+            <w:pPr>
+              <w:spacing w:before="20" w:after="20"/>
+            </w:pPr>
             <w:r>
               <w:rPr>
                 <w:b w:val="0"/>
                 <w:color w:val="CBD5E0"/>
                 <w:sz w:val="15"/>
               </w:rPr>
-              <w:t>▸ Faturação e Controlo Financeiro</w:t>
+              <w:t>▸ Faturação</w:t>
             </w:r>
           </w:p>
           <w:p>
+            <w:pPr>
+              <w:spacing w:before="20" w:after="20"/>
+            </w:pPr>
+            <w:r>
+              <w:rPr>
+                <w:b w:val="0"/>
+                <w:color w:val="CBD5E0"/>
+                <w:sz w:val="15"/>
+              </w:rPr>
+              <w:t>▸ Contas a Pagar e a Receber</w:t>
+            </w:r>
+          </w:p>
+          <w:p>
+            <w:pPr>
+              <w:spacing w:before="20" w:after="20"/>
+            </w:pPr>
+            <w:r>
+              <w:rPr>
+                <w:b w:val="0"/>
+                <w:color w:val="CBD5E0"/>
+                <w:sz w:val="15"/>
+              </w:rPr>
+              <w:t>▸ Reconciliações Bancárias</w:t>
+            </w:r>
+          </w:p>
+          <w:p>
+            <w:pPr>
+              <w:spacing w:before="20" w:after="20"/>
+            </w:pPr>
+            <w:r>
+              <w:rPr>
+                <w:b w:val="0"/>
+                <w:color w:val="CBD5E0"/>
+                <w:sz w:val="15"/>
+              </w:rPr>
+              <w:t>▸ Controlo Financeiro</w:t>
+            </w:r>
+          </w:p>
+          <w:p>
+            <w:pPr>
+              <w:spacing w:before="20" w:after="20"/>
+            </w:pPr>
+            <w:r>
+              <w:rPr>
+                <w:b w:val="0"/>
+                <w:color w:val="CBD5E0"/>
+                <w:sz w:val="15"/>
+              </w:rPr>
+              <w:t>▸ Apoio Contabilístico</w:t>
+            </w:r>
+          </w:p>
+          <w:p>
+            <w:pPr>
+              <w:spacing w:before="20" w:after="20"/>
+            </w:pPr>
             <w:r>
               <w:rPr>
                 <w:b w:val="0"/>
@@ -173,116 +261,22 @@
             </w:r>
           </w:p>
           <w:p>
-            <w:r>
-              <w:rPr>
-                <w:b w:val="0"/>
-                <w:color w:val="CBD5E0"/>
-                <w:sz w:val="15"/>
-              </w:rPr>
-              <w:t>▸ Reconciliações Bancárias</w:t>
-            </w:r>
-          </w:p>
-          <w:p>
-            <w:r>
-              <w:rPr>
-                <w:b w:val="0"/>
-                <w:color w:val="CBD5E0"/>
-                <w:sz w:val="15"/>
-              </w:rPr>
-              <w:t>▸ Apoio Contabilístico</w:t>
-            </w:r>
-          </w:p>
-          <w:p>
-            <w:r>
-              <w:rPr>
-                <w:b w:val="0"/>
-                <w:color w:val="CBD5E0"/>
-                <w:sz w:val="15"/>
-              </w:rPr>
-              <w:t>▸ Cegid Primavera</w:t>
-            </w:r>
-          </w:p>
-          <w:p>
-            <w:r>
-              <w:rPr>
-                <w:b w:val="0"/>
-                <w:color w:val="CBD5E0"/>
-                <w:sz w:val="15"/>
-              </w:rPr>
-              <w:t>▸ SAP Business One</w:t>
-            </w:r>
-          </w:p>
-          <w:p>
-            <w:r>
-              <w:rPr>
-                <w:b w:val="0"/>
-                <w:color w:val="CBD5E0"/>
-                <w:sz w:val="15"/>
-              </w:rPr>
-              <w:t>▸ TOC Online</w:t>
-            </w:r>
-          </w:p>
-          <w:p>
-            <w:r>
-              <w:rPr>
-                <w:b w:val="0"/>
-                <w:color w:val="CBD5E0"/>
-                <w:sz w:val="15"/>
-              </w:rPr>
-              <w:t>▸ Microsoft Office (Excel, Word)</w:t>
-            </w:r>
-          </w:p>
-          <w:p>
-            <w:r>
-              <w:rPr>
-                <w:b w:val="0"/>
-                <w:color w:val="CBD5E0"/>
-                <w:sz w:val="15"/>
-              </w:rPr>
-              <w:t>▸ New Hotel</w:t>
-            </w:r>
-          </w:p>
-          <w:p>
-            <w:r>
-              <w:rPr>
-                <w:b w:val="0"/>
-                <w:color w:val="CBD5E0"/>
-                <w:sz w:val="15"/>
-              </w:rPr>
-              <w:t>▸ WiseCrop</w:t>
-            </w:r>
-          </w:p>
-          <w:p>
-            <w:r>
-              <w:rPr>
-                <w:b w:val="0"/>
-                <w:color w:val="CBD5E0"/>
-                <w:sz w:val="15"/>
-              </w:rPr>
-              <w:t>▸ Gestão de Reservas</w:t>
-            </w:r>
-          </w:p>
-          <w:p>
-            <w:r>
-              <w:rPr>
-                <w:b w:val="0"/>
-                <w:color w:val="CBD5E0"/>
-                <w:sz w:val="15"/>
-              </w:rPr>
-              <w:t>▸ Atendimento ao Cliente</w:t>
-            </w:r>
-          </w:p>
-          <w:p>
+            <w:pPr>
+              <w:spacing w:before="160" w:after="80"/>
+            </w:pPr>
             <w:r>
               <w:rPr>
                 <w:b/>
                 <w:color w:val="96794A"/>
                 <w:sz w:val="20"/>
               </w:rPr>
-              <w:t>IDIOMAS</w:t>
+              <w:t>RECURSOS HUMANOS</w:t>
             </w:r>
           </w:p>
           <w:p>
+            <w:pPr>
+              <w:spacing w:before="0" w:after="80"/>
+            </w:pPr>
             <w:r>
               <w:rPr>
                 <w:color w:val="4A5568"/>
@@ -292,136 +286,100 @@
             </w:r>
           </w:p>
           <w:p>
+            <w:pPr>
+              <w:spacing w:before="20" w:after="20"/>
+            </w:pPr>
             <w:r>
               <w:rPr>
-                <w:b/>
-                <w:color w:val="E2E8F0"/>
-                <w:sz w:val="16"/>
+                <w:b w:val="0"/>
+                <w:color w:val="CBD5E0"/>
+                <w:sz w:val="15"/>
               </w:rPr>
-              <w:t>Português</w:t>
+              <w:t>▸ Processamento Salarial</w:t>
             </w:r>
           </w:p>
           <w:p>
+            <w:pPr>
+              <w:spacing w:before="20" w:after="20"/>
+            </w:pPr>
             <w:r>
               <w:rPr>
                 <w:b w:val="0"/>
-                <w:color w:val="A0AEC0"/>
-                <w:sz w:val="14"/>
+                <w:color w:val="CBD5E0"/>
+                <w:sz w:val="15"/>
               </w:rPr>
-              <w:t xml:space="preserve">  Nativo / Bilingue</w:t>
+              <w:t>▸ Admissões</w:t>
             </w:r>
           </w:p>
           <w:p>
+            <w:pPr>
+              <w:spacing w:before="20" w:after="20"/>
+            </w:pPr>
             <w:r>
               <w:rPr>
-                <w:b/>
-                <w:color w:val="E2E8F0"/>
-                <w:sz w:val="16"/>
+                <w:b w:val="0"/>
+                <w:color w:val="CBD5E0"/>
+                <w:sz w:val="15"/>
               </w:rPr>
-              <w:t>Romeno</w:t>
+              <w:t>▸ Contratos de Trabalho</w:t>
             </w:r>
           </w:p>
           <w:p>
+            <w:pPr>
+              <w:spacing w:before="20" w:after="20"/>
+            </w:pPr>
             <w:r>
               <w:rPr>
                 <w:b w:val="0"/>
-                <w:color w:val="A0AEC0"/>
-                <w:sz w:val="14"/>
+                <w:color w:val="CBD5E0"/>
+                <w:sz w:val="15"/>
               </w:rPr>
-              <w:t xml:space="preserve">  Nativo / Bilingue</w:t>
+              <w:t>▸ Controlo de Férias</w:t>
             </w:r>
           </w:p>
           <w:p>
+            <w:pPr>
+              <w:spacing w:before="20" w:after="20"/>
+            </w:pPr>
             <w:r>
               <w:rPr>
-                <w:b/>
-                <w:color w:val="E2E8F0"/>
-                <w:sz w:val="16"/>
+                <w:b w:val="0"/>
+                <w:color w:val="CBD5E0"/>
+                <w:sz w:val="15"/>
               </w:rPr>
-              <w:t>Inglês</w:t>
+              <w:t>▸ Medicina do Trabalho</w:t>
             </w:r>
           </w:p>
           <w:p>
+            <w:pPr>
+              <w:spacing w:before="20" w:after="20"/>
+            </w:pPr>
             <w:r>
               <w:rPr>
                 <w:b w:val="0"/>
-                <w:color w:val="A0AEC0"/>
-                <w:sz w:val="14"/>
+                <w:color w:val="CBD5E0"/>
+                <w:sz w:val="15"/>
               </w:rPr>
-              <w:t xml:space="preserve">  Profissional</w:t>
+              <w:t>▸ Formação</w:t>
             </w:r>
           </w:p>
           <w:p>
-            <w:r>
-              <w:rPr>
-                <w:b/>
-                <w:color w:val="E2E8F0"/>
-                <w:sz w:val="16"/>
-              </w:rPr>
-              <w:t>Russo</w:t>
-            </w:r>
-          </w:p>
-          <w:p>
-            <w:r>
-              <w:rPr>
-                <w:b w:val="0"/>
-                <w:color w:val="A0AEC0"/>
-                <w:sz w:val="14"/>
-              </w:rPr>
-              <w:t xml:space="preserve">  Profissional</w:t>
-            </w:r>
-          </w:p>
-          <w:p>
-            <w:r>
-              <w:rPr>
-                <w:b/>
-                <w:color w:val="E2E8F0"/>
-                <w:sz w:val="16"/>
-              </w:rPr>
-              <w:t>Espanhol</w:t>
-            </w:r>
-          </w:p>
-          <w:p>
-            <w:r>
-              <w:rPr>
-                <w:b w:val="0"/>
-                <w:color w:val="A0AEC0"/>
-                <w:sz w:val="14"/>
-              </w:rPr>
-              <w:t xml:space="preserve">  Elementar</w:t>
-            </w:r>
-          </w:p>
-          <w:p>
-            <w:r>
-              <w:rPr>
-                <w:b/>
-                <w:color w:val="E2E8F0"/>
-                <w:sz w:val="16"/>
-              </w:rPr>
-              <w:t>Ucraniano</w:t>
-            </w:r>
-          </w:p>
-          <w:p>
-            <w:r>
-              <w:rPr>
-                <w:b w:val="0"/>
-                <w:color w:val="A0AEC0"/>
-                <w:sz w:val="14"/>
-              </w:rPr>
-              <w:t xml:space="preserve">  Elementar</w:t>
-            </w:r>
-          </w:p>
-          <w:p>
+            <w:pPr>
+              <w:spacing w:before="160" w:after="80"/>
+            </w:pPr>
             <w:r>
               <w:rPr>
                 <w:b/>
                 <w:color w:val="96794A"/>
                 <w:sz w:val="20"/>
               </w:rPr>
-              <w:t>CERTIFICAÇÕES</w:t>
+              <w:t>COMPETÊNCIAS PESSOAIS</w:t>
             </w:r>
           </w:p>
           <w:p>
+            <w:pPr>
+              <w:spacing w:before="0" w:after="80"/>
+            </w:pPr>
             <w:r>
               <w:rPr>
                 <w:color w:val="4A5568"/>
@@ -431,13 +389,81 @@
             </w:r>
           </w:p>
           <w:p>
+            <w:pPr>
+              <w:spacing w:before="20" w:after="20"/>
+            </w:pPr>
             <w:r>
               <w:rPr>
                 <w:b w:val="0"/>
                 <w:color w:val="CBD5E0"/>
                 <w:sz w:val="15"/>
               </w:rPr>
-              <w:t>✓ Finanças para Não Financeiros</w:t>
+              <w:t>▸ Organização</w:t>
+            </w:r>
+          </w:p>
+          <w:p>
+            <w:pPr>
+              <w:spacing w:before="20" w:after="20"/>
+            </w:pPr>
+            <w:r>
+              <w:rPr>
+                <w:b w:val="0"/>
+                <w:color w:val="CBD5E0"/>
+                <w:sz w:val="15"/>
+              </w:rPr>
+              <w:t>▸ Rigor</w:t>
+            </w:r>
+          </w:p>
+          <w:p>
+            <w:pPr>
+              <w:spacing w:before="20" w:after="20"/>
+            </w:pPr>
+            <w:r>
+              <w:rPr>
+                <w:b w:val="0"/>
+                <w:color w:val="CBD5E0"/>
+                <w:sz w:val="15"/>
+              </w:rPr>
+              <w:t>▸ Adaptabilidade</w:t>
+            </w:r>
+          </w:p>
+          <w:p>
+            <w:pPr>
+              <w:spacing w:before="20" w:after="20"/>
+            </w:pPr>
+            <w:r>
+              <w:rPr>
+                <w:b w:val="0"/>
+                <w:color w:val="CBD5E0"/>
+                <w:sz w:val="15"/>
+              </w:rPr>
+              <w:t>▸ Trabalho em Equipa</w:t>
+            </w:r>
+          </w:p>
+          <w:p>
+            <w:pPr>
+              <w:spacing w:before="20" w:after="20"/>
+            </w:pPr>
+            <w:r>
+              <w:rPr>
+                <w:b w:val="0"/>
+                <w:color w:val="CBD5E0"/>
+                <w:sz w:val="15"/>
+              </w:rPr>
+              <w:t>▸ Proatividade</w:t>
+            </w:r>
+          </w:p>
+          <w:p>
+            <w:pPr>
+              <w:spacing w:before="20" w:after="20"/>
+            </w:pPr>
+            <w:r>
+              <w:rPr>
+                <w:b w:val="0"/>
+                <w:color w:val="CBD5E0"/>
+                <w:sz w:val="15"/>
+              </w:rPr>
+              <w:t>▸ Multilinguismo</w:t>
             </w:r>
           </w:p>
         </w:tc>
@@ -462,15 +488,34 @@
             </w:r>
           </w:p>
           <w:p>
+            <w:pPr>
+              <w:spacing w:before="40" w:after="40"/>
+            </w:pPr>
             <w:r>
               <w:rPr>
                 <w:color w:val="718096"/>
-                <w:sz w:val="22"/>
+                <w:sz w:val="19"/>
               </w:rPr>
-              <w:t>Assistente Administrativa e Financeira</w:t>
+              <w:t>Administrativa Financeira  |  Recursos Humanos  |  Contabilidade  |  Apoio à Gestão</w:t>
             </w:r>
           </w:p>
           <w:p>
+            <w:pPr>
+              <w:spacing w:before="0" w:after="160"/>
+            </w:pPr>
+            <w:r>
+              <w:rPr>
+                <w:i/>
+                <w:color w:val="96794A"/>
+                <w:sz w:val="18"/>
+              </w:rPr>
+              <w:t>Porque uma boa organização faz toda a diferença.</w:t>
+            </w:r>
+          </w:p>
+          <w:p>
+            <w:pPr>
+              <w:spacing w:before="0" w:after="160"/>
+            </w:pPr>
             <w:r>
               <w:rPr>
                 <w:color w:val="96794A"/>
@@ -480,6 +525,9 @@
             </w:r>
           </w:p>
           <w:p>
+            <w:pPr>
+              <w:spacing w:before="200" w:after="80"/>
+            </w:pPr>
             <w:r>
               <w:rPr>
                 <w:b/>
@@ -490,6 +538,9 @@
             </w:r>
           </w:p>
           <w:p>
+            <w:pPr>
+              <w:spacing w:before="0" w:after="120"/>
+            </w:pPr>
             <w:r>
               <w:rPr>
                 <w:color w:val="E2E8F0"/>
@@ -499,15 +550,395 @@
             </w:r>
           </w:p>
           <w:p>
+            <w:pPr>
+              <w:spacing w:after="80"/>
+            </w:pPr>
             <w:r>
               <w:rPr>
                 <w:color w:val="4A5568"/>
                 <w:sz w:val="17"/>
               </w:rPr>
-              <w:t>Profissional administrativa e financeira com mais de 8 anos de experiência em diversos setores, incluindo energias renováveis, agricultura, produção vinícola e hotelaria. Competências sólidas em gestão de clientes e fornecedores, faturação, controlo financeiro e apoio administrativo. Capacidade de organização, rigor no cumprimento de prazos e facilidade de adaptação a novos ambientes. Fluente em Português, Romeno, Inglês e Russo.</w:t>
+              <w:t>Ao longo dos últimos nove anos desenvolvi experiência em administração, finanças, recursos humanos e apoio à gestão em empresas dos setores das energias renováveis, agricultura, vitivinicultura e hotelaria.</w:t>
             </w:r>
           </w:p>
           <w:p>
+            <w:pPr>
+              <w:spacing w:after="80"/>
+            </w:pPr>
+            <w:r>
+              <w:rPr>
+                <w:color w:val="4A5568"/>
+                <w:sz w:val="17"/>
+              </w:rPr>
+              <w:t>Gosto de ambientes organizados, de resolver problemas e de criar processos que ajudam as equipas a trabalhar melhor.</w:t>
+            </w:r>
+          </w:p>
+          <w:p>
+            <w:pPr>
+              <w:spacing w:after="80"/>
+            </w:pPr>
+            <w:r>
+              <w:rPr>
+                <w:color w:val="4A5568"/>
+                <w:sz w:val="17"/>
+              </w:rPr>
+              <w:t>Destaco-me pela capacidade de adaptação, facilidade em aprender novas ferramentas e pelo compromisso com a qualidade do trabalho realizado.</w:t>
+            </w:r>
+          </w:p>
+          <w:p>
+            <w:pPr>
+              <w:spacing w:after="80"/>
+            </w:pPr>
+            <w:r>
+              <w:rPr>
+                <w:color w:val="4A5568"/>
+                <w:sz w:val="17"/>
+              </w:rPr>
+              <w:t>Atualmente procuro integrar uma organização onde possa continuar a crescer profissionalmente, assumir novas responsabilidades e contribuir para o sucesso da equipa.</w:t>
+            </w:r>
+          </w:p>
+          <w:p>
+            <w:pPr>
+              <w:spacing w:before="200" w:after="80"/>
+            </w:pPr>
+            <w:r>
+              <w:rPr>
+                <w:b/>
+                <w:color w:val="1A202C"/>
+                <w:sz w:val="22"/>
+              </w:rPr>
+              <w:t>O QUE POSSO TRAZER À SUA EMPRESA</w:t>
+            </w:r>
+          </w:p>
+          <w:p>
+            <w:pPr>
+              <w:spacing w:before="0" w:after="120"/>
+            </w:pPr>
+            <w:r>
+              <w:rPr>
+                <w:color w:val="E2E8F0"/>
+                <w:sz w:val="12"/>
+              </w:rPr>
+              <w:t>───────────────────────────────────────────────────────</w:t>
+            </w:r>
+          </w:p>
+          <w:tbl>
+            <w:tblPr>
+              <w:tblW w:type="auto" w:w="0"/>
+              <w:tblLayout w:type="fixed"/>
+              <w:tblLook w:firstColumn="1" w:firstRow="1" w:lastColumn="0" w:lastRow="0" w:noHBand="0" w:noVBand="1" w:val="04A0"/>
+            </w:tblPr>
+            <w:tblGrid>
+              <w:gridCol w:w="3827"/>
+              <w:gridCol w:w="3827"/>
+            </w:tblGrid>
+            <w:tr>
+              <w:tc>
+                <w:tcPr>
+                  <w:tcW w:type="dxa" w:w="3685"/>
+                  <w:tcBorders>
+                    <w:top w:val="none" w:sz="0" w:space="0" w:color="auto"/>
+                    <w:left w:val="none" w:sz="0" w:space="0" w:color="auto"/>
+                    <w:bottom w:val="none" w:sz="0" w:space="0" w:color="auto"/>
+                    <w:right w:val="none" w:sz="0" w:space="0" w:color="auto"/>
+                  </w:tcBorders>
+                </w:tcPr>
+                <w:p>
+                  <w:pPr>
+                    <w:spacing w:before="20" w:after="20"/>
+                  </w:pPr>
+                  <w:r>
+                    <w:rPr>
+                      <w:b/>
+                      <w:color w:val="96794A"/>
+                      <w:sz w:val="17"/>
+                    </w:rPr>
+                    <w:t xml:space="preserve">✓  </w:t>
+                  </w:r>
+                  <w:r>
+                    <w:rPr>
+                      <w:color w:val="2D3748"/>
+                      <w:sz w:val="17"/>
+                    </w:rPr>
+                    <w:t>Experiência em Administração</w:t>
+                  </w:r>
+                </w:p>
+              </w:tc>
+              <w:tc>
+                <w:tcPr>
+                  <w:tcW w:type="dxa" w:w="3685"/>
+                  <w:tcBorders>
+                    <w:top w:val="none" w:sz="0" w:space="0" w:color="auto"/>
+                    <w:left w:val="none" w:sz="0" w:space="0" w:color="auto"/>
+                    <w:bottom w:val="none" w:sz="0" w:space="0" w:color="auto"/>
+                    <w:right w:val="none" w:sz="0" w:space="0" w:color="auto"/>
+                  </w:tcBorders>
+                </w:tcPr>
+                <w:p>
+                  <w:pPr>
+                    <w:spacing w:before="20" w:after="20"/>
+                  </w:pPr>
+                  <w:r>
+                    <w:rPr>
+                      <w:b/>
+                      <w:color w:val="96794A"/>
+                      <w:sz w:val="17"/>
+                    </w:rPr>
+                    <w:t xml:space="preserve">✓  </w:t>
+                  </w:r>
+                  <w:r>
+                    <w:rPr>
+                      <w:color w:val="2D3748"/>
+                      <w:sz w:val="17"/>
+                    </w:rPr>
+                    <w:t>Experiência Financeira</w:t>
+                  </w:r>
+                </w:p>
+              </w:tc>
+            </w:tr>
+            <w:tr>
+              <w:tc>
+                <w:tcPr>
+                  <w:tcW w:type="dxa" w:w="3685"/>
+                  <w:tcBorders>
+                    <w:top w:val="none" w:sz="0" w:space="0" w:color="auto"/>
+                    <w:left w:val="none" w:sz="0" w:space="0" w:color="auto"/>
+                    <w:bottom w:val="none" w:sz="0" w:space="0" w:color="auto"/>
+                    <w:right w:val="none" w:sz="0" w:space="0" w:color="auto"/>
+                  </w:tcBorders>
+                </w:tcPr>
+                <w:p>
+                  <w:pPr>
+                    <w:spacing w:before="20" w:after="20"/>
+                  </w:pPr>
+                  <w:r>
+                    <w:rPr>
+                      <w:b/>
+                      <w:color w:val="96794A"/>
+                      <w:sz w:val="17"/>
+                    </w:rPr>
+                    <w:t xml:space="preserve">✓  </w:t>
+                  </w:r>
+                  <w:r>
+                    <w:rPr>
+                      <w:color w:val="2D3748"/>
+                      <w:sz w:val="17"/>
+                    </w:rPr>
+                    <w:t>Apoio à Contabilidade</w:t>
+                  </w:r>
+                </w:p>
+              </w:tc>
+              <w:tc>
+                <w:tcPr>
+                  <w:tcW w:type="dxa" w:w="3685"/>
+                  <w:tcBorders>
+                    <w:top w:val="none" w:sz="0" w:space="0" w:color="auto"/>
+                    <w:left w:val="none" w:sz="0" w:space="0" w:color="auto"/>
+                    <w:bottom w:val="none" w:sz="0" w:space="0" w:color="auto"/>
+                    <w:right w:val="none" w:sz="0" w:space="0" w:color="auto"/>
+                  </w:tcBorders>
+                </w:tcPr>
+                <w:p>
+                  <w:pPr>
+                    <w:spacing w:before="20" w:after="20"/>
+                  </w:pPr>
+                  <w:r>
+                    <w:rPr>
+                      <w:b/>
+                      <w:color w:val="96794A"/>
+                      <w:sz w:val="17"/>
+                    </w:rPr>
+                    <w:t xml:space="preserve">✓  </w:t>
+                  </w:r>
+                  <w:r>
+                    <w:rPr>
+                      <w:color w:val="2D3748"/>
+                      <w:sz w:val="17"/>
+                    </w:rPr>
+                    <w:t>Recursos Humanos</w:t>
+                  </w:r>
+                </w:p>
+              </w:tc>
+            </w:tr>
+            <w:tr>
+              <w:tc>
+                <w:tcPr>
+                  <w:tcW w:type="dxa" w:w="3685"/>
+                  <w:tcBorders>
+                    <w:top w:val="none" w:sz="0" w:space="0" w:color="auto"/>
+                    <w:left w:val="none" w:sz="0" w:space="0" w:color="auto"/>
+                    <w:bottom w:val="none" w:sz="0" w:space="0" w:color="auto"/>
+                    <w:right w:val="none" w:sz="0" w:space="0" w:color="auto"/>
+                  </w:tcBorders>
+                </w:tcPr>
+                <w:p>
+                  <w:pPr>
+                    <w:spacing w:before="20" w:after="20"/>
+                  </w:pPr>
+                  <w:r>
+                    <w:rPr>
+                      <w:b/>
+                      <w:color w:val="96794A"/>
+                      <w:sz w:val="17"/>
+                    </w:rPr>
+                    <w:t xml:space="preserve">✓  </w:t>
+                  </w:r>
+                  <w:r>
+                    <w:rPr>
+                      <w:color w:val="2D3748"/>
+                      <w:sz w:val="17"/>
+                    </w:rPr>
+                    <w:t>Gestão documental</w:t>
+                  </w:r>
+                </w:p>
+              </w:tc>
+              <w:tc>
+                <w:tcPr>
+                  <w:tcW w:type="dxa" w:w="3685"/>
+                  <w:tcBorders>
+                    <w:top w:val="none" w:sz="0" w:space="0" w:color="auto"/>
+                    <w:left w:val="none" w:sz="0" w:space="0" w:color="auto"/>
+                    <w:bottom w:val="none" w:sz="0" w:space="0" w:color="auto"/>
+                    <w:right w:val="none" w:sz="0" w:space="0" w:color="auto"/>
+                  </w:tcBorders>
+                </w:tcPr>
+                <w:p>
+                  <w:pPr>
+                    <w:spacing w:before="20" w:after="20"/>
+                  </w:pPr>
+                  <w:r>
+                    <w:rPr>
+                      <w:b/>
+                      <w:color w:val="96794A"/>
+                      <w:sz w:val="17"/>
+                    </w:rPr>
+                    <w:t xml:space="preserve">✓  </w:t>
+                  </w:r>
+                  <w:r>
+                    <w:rPr>
+                      <w:color w:val="2D3748"/>
+                      <w:sz w:val="17"/>
+                    </w:rPr>
+                    <w:t>Gestão de fornecedores</w:t>
+                  </w:r>
+                </w:p>
+              </w:tc>
+            </w:tr>
+            <w:tr>
+              <w:tc>
+                <w:tcPr>
+                  <w:tcW w:type="dxa" w:w="3685"/>
+                  <w:tcBorders>
+                    <w:top w:val="none" w:sz="0" w:space="0" w:color="auto"/>
+                    <w:left w:val="none" w:sz="0" w:space="0" w:color="auto"/>
+                    <w:bottom w:val="none" w:sz="0" w:space="0" w:color="auto"/>
+                    <w:right w:val="none" w:sz="0" w:space="0" w:color="auto"/>
+                  </w:tcBorders>
+                </w:tcPr>
+                <w:p>
+                  <w:pPr>
+                    <w:spacing w:before="20" w:after="20"/>
+                  </w:pPr>
+                  <w:r>
+                    <w:rPr>
+                      <w:b/>
+                      <w:color w:val="96794A"/>
+                      <w:sz w:val="17"/>
+                    </w:rPr>
+                    <w:t xml:space="preserve">✓  </w:t>
+                  </w:r>
+                  <w:r>
+                    <w:rPr>
+                      <w:color w:val="2D3748"/>
+                      <w:sz w:val="17"/>
+                    </w:rPr>
+                    <w:t>ERP Cegid Primavera</w:t>
+                  </w:r>
+                </w:p>
+              </w:tc>
+              <w:tc>
+                <w:tcPr>
+                  <w:tcW w:type="dxa" w:w="3685"/>
+                  <w:tcBorders>
+                    <w:top w:val="none" w:sz="0" w:space="0" w:color="auto"/>
+                    <w:left w:val="none" w:sz="0" w:space="0" w:color="auto"/>
+                    <w:bottom w:val="none" w:sz="0" w:space="0" w:color="auto"/>
+                    <w:right w:val="none" w:sz="0" w:space="0" w:color="auto"/>
+                  </w:tcBorders>
+                </w:tcPr>
+                <w:p>
+                  <w:pPr>
+                    <w:spacing w:before="20" w:after="20"/>
+                  </w:pPr>
+                  <w:r>
+                    <w:rPr>
+                      <w:b/>
+                      <w:color w:val="96794A"/>
+                      <w:sz w:val="17"/>
+                    </w:rPr>
+                    <w:t xml:space="preserve">✓  </w:t>
+                  </w:r>
+                  <w:r>
+                    <w:rPr>
+                      <w:color w:val="2D3748"/>
+                      <w:sz w:val="17"/>
+                    </w:rPr>
+                    <w:t>SAP Business One</w:t>
+                  </w:r>
+                </w:p>
+              </w:tc>
+            </w:tr>
+            <w:tr>
+              <w:tc>
+                <w:tcPr>
+                  <w:tcW w:type="dxa" w:w="3685"/>
+                  <w:tcBorders>
+                    <w:top w:val="none" w:sz="0" w:space="0" w:color="auto"/>
+                    <w:left w:val="none" w:sz="0" w:space="0" w:color="auto"/>
+                    <w:bottom w:val="none" w:sz="0" w:space="0" w:color="auto"/>
+                    <w:right w:val="none" w:sz="0" w:space="0" w:color="auto"/>
+                  </w:tcBorders>
+                </w:tcPr>
+                <w:p>
+                  <w:pPr>
+                    <w:spacing w:before="20" w:after="20"/>
+                  </w:pPr>
+                  <w:r>
+                    <w:rPr>
+                      <w:b/>
+                      <w:color w:val="96794A"/>
+                      <w:sz w:val="17"/>
+                    </w:rPr>
+                    <w:t xml:space="preserve">✓  </w:t>
+                  </w:r>
+                  <w:r>
+                    <w:rPr>
+                      <w:color w:val="2D3748"/>
+                      <w:sz w:val="17"/>
+                    </w:rPr>
+                    <w:t>Fluência em 4 idiomas</w:t>
+                  </w:r>
+                </w:p>
+              </w:tc>
+              <w:tc>
+                <w:tcPr>
+                  <w:tcW w:type="dxa" w:w="3827"/>
+                  <w:tcBorders>
+                    <w:top w:val="none" w:sz="0" w:space="0" w:color="auto"/>
+                    <w:left w:val="none" w:sz="0" w:space="0" w:color="auto"/>
+                    <w:bottom w:val="none" w:sz="0" w:space="0" w:color="auto"/>
+                    <w:right w:val="none" w:sz="0" w:space="0" w:color="auto"/>
+                  </w:tcBorders>
+                </w:tcPr>
+                <w:p/>
+              </w:tc>
+            </w:tr>
+          </w:tbl>
+          <w:p/>
+          <w:p>
+            <w:pPr>
+              <w:spacing w:before="200" w:after="80"/>
+            </w:pPr>
             <w:r>
               <w:rPr>
                 <w:b/>
@@ -518,6 +949,9 @@
             </w:r>
           </w:p>
           <w:p>
+            <w:pPr>
+              <w:spacing w:before="0" w:after="120"/>
+            </w:pPr>
             <w:r>
               <w:rPr>
                 <w:color w:val="E2E8F0"/>
@@ -527,6 +961,9 @@
             </w:r>
           </w:p>
           <w:p>
+            <w:pPr>
+              <w:spacing w:before="100" w:after="0"/>
+            </w:pPr>
             <w:r>
               <w:rPr>
                 <w:b/>
@@ -551,6 +988,9 @@
             </w:r>
           </w:p>
           <w:p>
+            <w:pPr>
+              <w:spacing w:before="0" w:after="40"/>
+            </w:pPr>
             <w:r>
               <w:rPr>
                 <w:b/>
@@ -568,15 +1008,69 @@
             </w:r>
           </w:p>
           <w:p>
+            <w:pPr>
+              <w:spacing w:before="0" w:after="0"/>
+              <w:ind w:left="198"/>
+            </w:pPr>
+            <w:r>
+              <w:rPr>
+                <w:color w:val="96794A"/>
+                <w:sz w:val="16"/>
+              </w:rPr>
+              <w:t xml:space="preserve">▪  </w:t>
+            </w:r>
             <w:r>
               <w:rPr>
                 <w:color w:val="4A5568"/>
                 <w:sz w:val="16"/>
               </w:rPr>
-              <w:t>Gestão administrativa geral, apoio à operação e controlo documental.</w:t>
+              <w:t>Gestão administrativa geral</w:t>
             </w:r>
           </w:p>
           <w:p>
+            <w:pPr>
+              <w:spacing w:before="0" w:after="0"/>
+              <w:ind w:left="198"/>
+            </w:pPr>
+            <w:r>
+              <w:rPr>
+                <w:color w:val="96794A"/>
+                <w:sz w:val="16"/>
+              </w:rPr>
+              <w:t xml:space="preserve">▪  </w:t>
+            </w:r>
+            <w:r>
+              <w:rPr>
+                <w:color w:val="4A5568"/>
+                <w:sz w:val="16"/>
+              </w:rPr>
+              <w:t>Apoio à operação e à gestão</w:t>
+            </w:r>
+          </w:p>
+          <w:p>
+            <w:pPr>
+              <w:spacing w:before="0" w:after="0"/>
+              <w:ind w:left="198"/>
+            </w:pPr>
+            <w:r>
+              <w:rPr>
+                <w:color w:val="96794A"/>
+                <w:sz w:val="16"/>
+              </w:rPr>
+              <w:t xml:space="preserve">▪  </w:t>
+            </w:r>
+            <w:r>
+              <w:rPr>
+                <w:color w:val="4A5568"/>
+                <w:sz w:val="16"/>
+              </w:rPr>
+              <w:t>Controlo e organização documental</w:t>
+            </w:r>
+          </w:p>
+          <w:p>
+            <w:pPr>
+              <w:spacing w:before="100" w:after="0"/>
+            </w:pPr>
             <w:r>
               <w:rPr>
                 <w:b/>
@@ -601,6 +1095,9 @@
             </w:r>
           </w:p>
           <w:p>
+            <w:pPr>
+              <w:spacing w:before="0" w:after="40"/>
+            </w:pPr>
             <w:r>
               <w:rPr>
                 <w:b/>
@@ -618,15 +1115,169 @@
             </w:r>
           </w:p>
           <w:p>
+            <w:pPr>
+              <w:spacing w:before="0" w:after="0"/>
+              <w:ind w:left="198"/>
+            </w:pPr>
+            <w:r>
+              <w:rPr>
+                <w:color w:val="96794A"/>
+                <w:sz w:val="16"/>
+              </w:rPr>
+              <w:t xml:space="preserve">▪  </w:t>
+            </w:r>
             <w:r>
               <w:rPr>
                 <w:color w:val="4A5568"/>
                 <w:sz w:val="16"/>
               </w:rPr>
-              <w:t>Faturação, contas a pagar/receber, reconciliações bancárias, gestão de fornecedores e apoio contabilístico.</w:t>
+              <w:t>Gestão de mais de 100 fornecedores</w:t>
             </w:r>
           </w:p>
           <w:p>
+            <w:pPr>
+              <w:spacing w:before="0" w:after="0"/>
+              <w:ind w:left="198"/>
+            </w:pPr>
+            <w:r>
+              <w:rPr>
+                <w:color w:val="96794A"/>
+                <w:sz w:val="16"/>
+              </w:rPr>
+              <w:t xml:space="preserve">▪  </w:t>
+            </w:r>
+            <w:r>
+              <w:rPr>
+                <w:color w:val="4A5568"/>
+                <w:sz w:val="16"/>
+              </w:rPr>
+              <w:t>Faturação diária</w:t>
+            </w:r>
+          </w:p>
+          <w:p>
+            <w:pPr>
+              <w:spacing w:before="0" w:after="0"/>
+              <w:ind w:left="198"/>
+            </w:pPr>
+            <w:r>
+              <w:rPr>
+                <w:color w:val="96794A"/>
+                <w:sz w:val="16"/>
+              </w:rPr>
+              <w:t xml:space="preserve">▪  </w:t>
+            </w:r>
+            <w:r>
+              <w:rPr>
+                <w:color w:val="4A5568"/>
+                <w:sz w:val="16"/>
+              </w:rPr>
+              <w:t>Reconciliações bancárias diárias</w:t>
+            </w:r>
+          </w:p>
+          <w:p>
+            <w:pPr>
+              <w:spacing w:before="0" w:after="0"/>
+              <w:ind w:left="198"/>
+            </w:pPr>
+            <w:r>
+              <w:rPr>
+                <w:color w:val="96794A"/>
+                <w:sz w:val="16"/>
+              </w:rPr>
+              <w:t xml:space="preserve">▪  </w:t>
+            </w:r>
+            <w:r>
+              <w:rPr>
+                <w:color w:val="4A5568"/>
+                <w:sz w:val="16"/>
+              </w:rPr>
+              <w:t>Pagamentos e controlo de contas a pagar e a receber</w:t>
+            </w:r>
+          </w:p>
+          <w:p>
+            <w:pPr>
+              <w:spacing w:before="0" w:after="0"/>
+              <w:ind w:left="198"/>
+            </w:pPr>
+            <w:r>
+              <w:rPr>
+                <w:color w:val="96794A"/>
+                <w:sz w:val="16"/>
+              </w:rPr>
+              <w:t xml:space="preserve">▪  </w:t>
+            </w:r>
+            <w:r>
+              <w:rPr>
+                <w:color w:val="4A5568"/>
+                <w:sz w:val="16"/>
+              </w:rPr>
+              <w:t>Preparação de documentação contabilística</w:t>
+            </w:r>
+          </w:p>
+          <w:p>
+            <w:pPr>
+              <w:spacing w:before="0" w:after="0"/>
+              <w:ind w:left="198"/>
+            </w:pPr>
+            <w:r>
+              <w:rPr>
+                <w:color w:val="96794A"/>
+                <w:sz w:val="16"/>
+              </w:rPr>
+              <w:t xml:space="preserve">▪  </w:t>
+            </w:r>
+            <w:r>
+              <w:rPr>
+                <w:color w:val="4A5568"/>
+                <w:sz w:val="16"/>
+              </w:rPr>
+              <w:t>Controlo financeiro e apoio à gestão</w:t>
+            </w:r>
+          </w:p>
+          <w:p>
+            <w:pPr>
+              <w:spacing w:before="0" w:after="0"/>
+              <w:ind w:left="198"/>
+            </w:pPr>
+            <w:r>
+              <w:rPr>
+                <w:color w:val="96794A"/>
+                <w:sz w:val="16"/>
+              </w:rPr>
+              <w:t xml:space="preserve">▪  </w:t>
+            </w:r>
+            <w:r>
+              <w:rPr>
+                <w:color w:val="4A5568"/>
+                <w:sz w:val="16"/>
+              </w:rPr>
+              <w:t>Processamento salarial, admissões e contratos de trabalho</w:t>
+            </w:r>
+          </w:p>
+          <w:p>
+            <w:pPr>
+              <w:spacing w:before="0" w:after="0"/>
+              <w:ind w:left="198"/>
+            </w:pPr>
+            <w:r>
+              <w:rPr>
+                <w:color w:val="96794A"/>
+                <w:sz w:val="16"/>
+              </w:rPr>
+              <w:t xml:space="preserve">▪  </w:t>
+            </w:r>
+            <w:r>
+              <w:rPr>
+                <w:color w:val="4A5568"/>
+                <w:sz w:val="16"/>
+              </w:rPr>
+              <w:t>Controlo de férias, medicina do trabalho e formação</w:t>
+            </w:r>
+          </w:p>
+          <w:p>
+            <w:pPr>
+              <w:spacing w:before="100" w:after="0"/>
+            </w:pPr>
             <w:r>
               <w:rPr>
                 <w:b/>
@@ -651,6 +1302,9 @@
             </w:r>
           </w:p>
           <w:p>
+            <w:pPr>
+              <w:spacing w:before="0" w:after="40"/>
+            </w:pPr>
             <w:r>
               <w:rPr>
                 <w:b/>
@@ -668,15 +1322,504 @@
             </w:r>
           </w:p>
           <w:p>
+            <w:pPr>
+              <w:spacing w:before="0" w:after="0"/>
+              <w:ind w:left="198"/>
+            </w:pPr>
+            <w:r>
+              <w:rPr>
+                <w:color w:val="96794A"/>
+                <w:sz w:val="16"/>
+              </w:rPr>
+              <w:t xml:space="preserve">▪  </w:t>
+            </w:r>
             <w:r>
               <w:rPr>
                 <w:color w:val="4A5568"/>
                 <w:sz w:val="16"/>
               </w:rPr>
-              <w:t>Gestão documental de projetos fotovoltaicos, coordenação com clientes e fornecedores.</w:t>
+              <w:t>Gestão documental de projetos fotovoltaicos</w:t>
             </w:r>
           </w:p>
           <w:p>
+            <w:pPr>
+              <w:spacing w:before="0" w:after="0"/>
+              <w:ind w:left="198"/>
+            </w:pPr>
+            <w:r>
+              <w:rPr>
+                <w:color w:val="96794A"/>
+                <w:sz w:val="16"/>
+              </w:rPr>
+              <w:t xml:space="preserve">▪  </w:t>
+            </w:r>
+            <w:r>
+              <w:rPr>
+                <w:color w:val="4A5568"/>
+                <w:sz w:val="16"/>
+              </w:rPr>
+              <w:t>Coordenação com clientes e fornecedores</w:t>
+            </w:r>
+          </w:p>
+          <w:p>
+            <w:pPr>
+              <w:spacing w:before="0" w:after="0"/>
+              <w:ind w:left="198"/>
+            </w:pPr>
+            <w:r>
+              <w:rPr>
+                <w:color w:val="96794A"/>
+                <w:sz w:val="16"/>
+              </w:rPr>
+              <w:t xml:space="preserve">▪  </w:t>
+            </w:r>
+            <w:r>
+              <w:rPr>
+                <w:color w:val="4A5568"/>
+                <w:sz w:val="16"/>
+              </w:rPr>
+              <w:t>Suporte administrativo à equipa de engenharia</w:t>
+            </w:r>
+          </w:p>
+          <w:p>
+            <w:pPr>
+              <w:spacing w:before="0" w:after="0"/>
+              <w:ind w:left="198"/>
+            </w:pPr>
+            <w:r>
+              <w:rPr>
+                <w:color w:val="96794A"/>
+                <w:sz w:val="16"/>
+              </w:rPr>
+              <w:t xml:space="preserve">▪  </w:t>
+            </w:r>
+            <w:r>
+              <w:rPr>
+                <w:color w:val="4A5568"/>
+                <w:sz w:val="16"/>
+              </w:rPr>
+              <w:t>Apoio ao departamento de recursos humanos</w:t>
+            </w:r>
+          </w:p>
+        </w:tc>
+      </w:tr>
+    </w:tbl>
+    <w:p>
+      <w:pPr>
+        <w:spacing w:before="0" w:after="0" w:lineRule="exact" w:line="20"/>
+        <w:rPr>
+          <w:sz w:val="2"/>
+        </w:rPr>
+      </w:pPr>
+      <w:r>
+        <w:rPr>
+          <w:sz w:val="2"/>
+        </w:rPr>
+        <w:br w:type="page"/>
+      </w:r>
+    </w:p>
+    <w:tbl>
+      <w:tblPr>
+        <w:tblW w:type="auto" w:w="0"/>
+        <w:jc w:val="center"/>
+        <w:tblLayout w:type="fixed"/>
+        <w:tblLook w:firstColumn="1" w:firstRow="1" w:lastColumn="0" w:lastRow="0" w:noHBand="0" w:noVBand="1" w:val="04A0"/>
+      </w:tblPr>
+      <w:tblGrid>
+        <w:gridCol w:w="5837"/>
+        <w:gridCol w:w="5837"/>
+      </w:tblGrid>
+      <w:tr>
+        <w:trPr>
+          <w:trHeight w:val="14967" w:hRule="atLeast"/>
+        </w:trPr>
+        <w:tc>
+          <w:tcPr>
+            <w:tcW w:type="dxa" w:w="3685"/>
+            <w:shd w:val="clear" w:color="auto" w:fill="1a202c"/>
+            <w:tcBorders>
+              <w:top w:val="none" w:sz="0" w:space="0" w:color="auto"/>
+              <w:left w:val="none" w:sz="0" w:space="0" w:color="auto"/>
+              <w:bottom w:val="none" w:sz="0" w:space="0" w:color="auto"/>
+              <w:right w:val="none" w:sz="0" w:space="0" w:color="auto"/>
+            </w:tcBorders>
+          </w:tcPr>
+          <w:p/>
+          <w:p>
+            <w:pPr>
+              <w:spacing w:before="160" w:after="80"/>
+            </w:pPr>
+            <w:r>
+              <w:rPr>
+                <w:b/>
+                <w:color w:val="96794A"/>
+                <w:sz w:val="20"/>
+              </w:rPr>
+              <w:t>SOFTWARE</w:t>
+            </w:r>
+          </w:p>
+          <w:p>
+            <w:pPr>
+              <w:spacing w:before="0" w:after="80"/>
+            </w:pPr>
+            <w:r>
+              <w:rPr>
+                <w:color w:val="4A5568"/>
+                <w:sz w:val="12"/>
+              </w:rPr>
+              <w:t>─────────────────────────</w:t>
+            </w:r>
+          </w:p>
+          <w:p>
+            <w:pPr>
+              <w:spacing w:before="20" w:after="20"/>
+            </w:pPr>
+            <w:r>
+              <w:rPr>
+                <w:b/>
+                <w:color w:val="E2E8F0"/>
+                <w:sz w:val="16"/>
+              </w:rPr>
+              <w:t>Cegid Primavera</w:t>
+            </w:r>
+          </w:p>
+          <w:p>
+            <w:pPr>
+              <w:spacing w:before="0" w:after="60"/>
+            </w:pPr>
+            <w:r>
+              <w:rPr>
+                <w:rFonts w:ascii="Segoe UI Symbol" w:hAnsi="Segoe UI Symbol" w:eastAsia="Segoe UI Symbol"/>
+                <w:color w:val="96794A"/>
+                <w:sz w:val="16"/>
+              </w:rPr>
+              <w:t>★★★★★</w:t>
+            </w:r>
+          </w:p>
+          <w:p>
+            <w:pPr>
+              <w:spacing w:before="20" w:after="20"/>
+            </w:pPr>
+            <w:r>
+              <w:rPr>
+                <w:b/>
+                <w:color w:val="E2E8F0"/>
+                <w:sz w:val="16"/>
+              </w:rPr>
+              <w:t>SAP Business One</w:t>
+            </w:r>
+          </w:p>
+          <w:p>
+            <w:pPr>
+              <w:spacing w:before="0" w:after="60"/>
+            </w:pPr>
+            <w:r>
+              <w:rPr>
+                <w:rFonts w:ascii="Segoe UI Symbol" w:hAnsi="Segoe UI Symbol" w:eastAsia="Segoe UI Symbol"/>
+                <w:color w:val="96794A"/>
+                <w:sz w:val="16"/>
+              </w:rPr>
+              <w:t>★★★★☆</w:t>
+            </w:r>
+          </w:p>
+          <w:p>
+            <w:pPr>
+              <w:spacing w:before="20" w:after="20"/>
+            </w:pPr>
+            <w:r>
+              <w:rPr>
+                <w:b/>
+                <w:color w:val="E2E8F0"/>
+                <w:sz w:val="16"/>
+              </w:rPr>
+              <w:t>Microsoft Excel</w:t>
+            </w:r>
+          </w:p>
+          <w:p>
+            <w:pPr>
+              <w:spacing w:before="0" w:after="60"/>
+            </w:pPr>
+            <w:r>
+              <w:rPr>
+                <w:rFonts w:ascii="Segoe UI Symbol" w:hAnsi="Segoe UI Symbol" w:eastAsia="Segoe UI Symbol"/>
+                <w:color w:val="96794A"/>
+                <w:sz w:val="16"/>
+              </w:rPr>
+              <w:t>★★★★☆</w:t>
+            </w:r>
+          </w:p>
+          <w:p>
+            <w:pPr>
+              <w:spacing w:before="20" w:after="20"/>
+            </w:pPr>
+            <w:r>
+              <w:rPr>
+                <w:b/>
+                <w:color w:val="E2E8F0"/>
+                <w:sz w:val="16"/>
+              </w:rPr>
+              <w:t>TOC Online</w:t>
+            </w:r>
+          </w:p>
+          <w:p>
+            <w:pPr>
+              <w:spacing w:before="0" w:after="60"/>
+            </w:pPr>
+            <w:r>
+              <w:rPr>
+                <w:rFonts w:ascii="Segoe UI Symbol" w:hAnsi="Segoe UI Symbol" w:eastAsia="Segoe UI Symbol"/>
+                <w:color w:val="96794A"/>
+                <w:sz w:val="16"/>
+              </w:rPr>
+              <w:t>★★★☆☆</w:t>
+            </w:r>
+          </w:p>
+          <w:p>
+            <w:pPr>
+              <w:spacing w:before="20" w:after="20"/>
+            </w:pPr>
+            <w:r>
+              <w:rPr>
+                <w:b w:val="0"/>
+                <w:color w:val="A0AEC0"/>
+                <w:sz w:val="14"/>
+              </w:rPr>
+              <w:t>Também: New Hotel, WiseCrop, Word, Outlook, Teams</w:t>
+            </w:r>
+          </w:p>
+          <w:p>
+            <w:pPr>
+              <w:spacing w:before="160" w:after="80"/>
+            </w:pPr>
+            <w:r>
+              <w:rPr>
+                <w:b/>
+                <w:color w:val="96794A"/>
+                <w:sz w:val="20"/>
+              </w:rPr>
+              <w:t>IDIOMAS</w:t>
+            </w:r>
+          </w:p>
+          <w:p>
+            <w:pPr>
+              <w:spacing w:before="0" w:after="80"/>
+            </w:pPr>
+            <w:r>
+              <w:rPr>
+                <w:color w:val="4A5568"/>
+                <w:sz w:val="12"/>
+              </w:rPr>
+              <w:t>─────────────────────────</w:t>
+            </w:r>
+          </w:p>
+          <w:p>
+            <w:pPr>
+              <w:spacing w:before="20" w:after="20"/>
+            </w:pPr>
+            <w:r>
+              <w:rPr>
+                <w:b/>
+                <w:color w:val="E2E8F0"/>
+                <w:sz w:val="16"/>
+              </w:rPr>
+              <w:t>Português</w:t>
+            </w:r>
+          </w:p>
+          <w:p>
+            <w:pPr>
+              <w:spacing w:before="20" w:after="20"/>
+            </w:pPr>
+            <w:r>
+              <w:rPr>
+                <w:b w:val="0"/>
+                <w:color w:val="A0AEC0"/>
+                <w:sz w:val="14"/>
+              </w:rPr>
+              <w:t xml:space="preserve">  Nativo</w:t>
+            </w:r>
+          </w:p>
+          <w:p>
+            <w:pPr>
+              <w:spacing w:before="20" w:after="20"/>
+            </w:pPr>
+            <w:r>
+              <w:rPr>
+                <w:b/>
+                <w:color w:val="E2E8F0"/>
+                <w:sz w:val="16"/>
+              </w:rPr>
+              <w:t>Romeno</w:t>
+            </w:r>
+          </w:p>
+          <w:p>
+            <w:pPr>
+              <w:spacing w:before="20" w:after="20"/>
+            </w:pPr>
+            <w:r>
+              <w:rPr>
+                <w:b w:val="0"/>
+                <w:color w:val="A0AEC0"/>
+                <w:sz w:val="14"/>
+              </w:rPr>
+              <w:t xml:space="preserve">  Nativo</w:t>
+            </w:r>
+          </w:p>
+          <w:p>
+            <w:pPr>
+              <w:spacing w:before="20" w:after="20"/>
+            </w:pPr>
+            <w:r>
+              <w:rPr>
+                <w:b/>
+                <w:color w:val="E2E8F0"/>
+                <w:sz w:val="16"/>
+              </w:rPr>
+              <w:t>Russo</w:t>
+            </w:r>
+          </w:p>
+          <w:p>
+            <w:pPr>
+              <w:spacing w:before="20" w:after="20"/>
+            </w:pPr>
+            <w:r>
+              <w:rPr>
+                <w:b w:val="0"/>
+                <w:color w:val="A0AEC0"/>
+                <w:sz w:val="14"/>
+              </w:rPr>
+              <w:t xml:space="preserve">  Nativo</w:t>
+            </w:r>
+          </w:p>
+          <w:p>
+            <w:pPr>
+              <w:spacing w:before="20" w:after="20"/>
+            </w:pPr>
+            <w:r>
+              <w:rPr>
+                <w:b/>
+                <w:color w:val="E2E8F0"/>
+                <w:sz w:val="16"/>
+              </w:rPr>
+              <w:t>Inglês</w:t>
+            </w:r>
+          </w:p>
+          <w:p>
+            <w:pPr>
+              <w:spacing w:before="20" w:after="20"/>
+            </w:pPr>
+            <w:r>
+              <w:rPr>
+                <w:b w:val="0"/>
+                <w:color w:val="A0AEC0"/>
+                <w:sz w:val="14"/>
+              </w:rPr>
+              <w:t xml:space="preserve">  Profissional</w:t>
+            </w:r>
+          </w:p>
+          <w:p>
+            <w:pPr>
+              <w:spacing w:before="20" w:after="20"/>
+            </w:pPr>
+            <w:r>
+              <w:rPr>
+                <w:b/>
+                <w:color w:val="E2E8F0"/>
+                <w:sz w:val="16"/>
+              </w:rPr>
+              <w:t>Espanhol</w:t>
+            </w:r>
+          </w:p>
+          <w:p>
+            <w:pPr>
+              <w:spacing w:before="20" w:after="20"/>
+            </w:pPr>
+            <w:r>
+              <w:rPr>
+                <w:b w:val="0"/>
+                <w:color w:val="A0AEC0"/>
+                <w:sz w:val="14"/>
+              </w:rPr>
+              <w:t xml:space="preserve">  Elementar</w:t>
+            </w:r>
+          </w:p>
+          <w:p>
+            <w:pPr>
+              <w:spacing w:before="160" w:after="80"/>
+            </w:pPr>
+            <w:r>
+              <w:rPr>
+                <w:b/>
+                <w:color w:val="96794A"/>
+                <w:sz w:val="20"/>
+              </w:rPr>
+              <w:t>CERTIFICAÇÕES</w:t>
+            </w:r>
+          </w:p>
+          <w:p>
+            <w:pPr>
+              <w:spacing w:before="0" w:after="80"/>
+            </w:pPr>
+            <w:r>
+              <w:rPr>
+                <w:color w:val="4A5568"/>
+                <w:sz w:val="12"/>
+              </w:rPr>
+              <w:t>─────────────────────────</w:t>
+            </w:r>
+          </w:p>
+          <w:p>
+            <w:pPr>
+              <w:spacing w:before="20" w:after="20"/>
+            </w:pPr>
+            <w:r>
+              <w:rPr>
+                <w:b w:val="0"/>
+                <w:color w:val="CBD5E0"/>
+                <w:sz w:val="15"/>
+              </w:rPr>
+              <w:t>✓ Finanças para Não Financeiros</w:t>
+            </w:r>
+          </w:p>
+        </w:tc>
+        <w:tc>
+          <w:tcPr>
+            <w:tcW w:type="dxa" w:w="7654"/>
+            <w:tcBorders>
+              <w:top w:val="none" w:sz="0" w:space="0" w:color="auto"/>
+              <w:left w:val="none" w:sz="0" w:space="0" w:color="auto"/>
+              <w:bottom w:val="none" w:sz="0" w:space="0" w:color="auto"/>
+              <w:right w:val="none" w:sz="0" w:space="0" w:color="auto"/>
+            </w:tcBorders>
+          </w:tcPr>
+          <w:p>
+            <w:pPr>
+              <w:spacing w:after="0"/>
+            </w:pPr>
+            <w:r>
+              <w:rPr>
+                <w:b/>
+                <w:color w:val="1A202C"/>
+                <w:sz w:val="22"/>
+              </w:rPr>
+              <w:t>EXPERIÊNCIA PROFISSIONAL (CONT.)</w:t>
+            </w:r>
+          </w:p>
+          <w:p>
+            <w:pPr>
+              <w:spacing w:before="0" w:after="120"/>
+            </w:pPr>
+            <w:r>
+              <w:rPr>
+                <w:color w:val="E2E8F0"/>
+                <w:sz w:val="12"/>
+              </w:rPr>
+              <w:t>───────────────────────────────────────────────────────</w:t>
+            </w:r>
+          </w:p>
+          <w:p>
+            <w:pPr>
+              <w:spacing w:before="100" w:after="0"/>
+            </w:pPr>
             <w:r>
               <w:rPr>
                 <w:b/>
@@ -701,6 +1844,9 @@
             </w:r>
           </w:p>
           <w:p>
+            <w:pPr>
+              <w:spacing w:before="0" w:after="40"/>
+            </w:pPr>
             <w:r>
               <w:rPr>
                 <w:b/>
@@ -718,15 +1864,69 @@
             </w:r>
           </w:p>
           <w:p>
+            <w:pPr>
+              <w:spacing w:before="0" w:after="0"/>
+              <w:ind w:left="198"/>
+            </w:pPr>
+            <w:r>
+              <w:rPr>
+                <w:color w:val="96794A"/>
+                <w:sz w:val="16"/>
+              </w:rPr>
+              <w:t xml:space="preserve">▪  </w:t>
+            </w:r>
             <w:r>
               <w:rPr>
                 <w:color w:val="4A5568"/>
                 <w:sz w:val="16"/>
               </w:rPr>
-              <w:t>Gestão administrativa e financeira no setor agrícola, faturação e controlo de fornecedores.</w:t>
+              <w:t>Gestão administrativa e financeira no setor agrícola</w:t>
             </w:r>
           </w:p>
           <w:p>
+            <w:pPr>
+              <w:spacing w:before="0" w:after="0"/>
+              <w:ind w:left="198"/>
+            </w:pPr>
+            <w:r>
+              <w:rPr>
+                <w:color w:val="96794A"/>
+                <w:sz w:val="16"/>
+              </w:rPr>
+              <w:t xml:space="preserve">▪  </w:t>
+            </w:r>
+            <w:r>
+              <w:rPr>
+                <w:color w:val="4A5568"/>
+                <w:sz w:val="16"/>
+              </w:rPr>
+              <w:t>Faturação e controlo de fornecedores</w:t>
+            </w:r>
+          </w:p>
+          <w:p>
+            <w:pPr>
+              <w:spacing w:before="0" w:after="0"/>
+              <w:ind w:left="198"/>
+            </w:pPr>
+            <w:r>
+              <w:rPr>
+                <w:color w:val="96794A"/>
+                <w:sz w:val="16"/>
+              </w:rPr>
+              <w:t xml:space="preserve">▪  </w:t>
+            </w:r>
+            <w:r>
+              <w:rPr>
+                <w:color w:val="4A5568"/>
+                <w:sz w:val="16"/>
+              </w:rPr>
+              <w:t>Apoio contabilístico</w:t>
+            </w:r>
+          </w:p>
+          <w:p>
+            <w:pPr>
+              <w:spacing w:before="100" w:after="0"/>
+            </w:pPr>
             <w:r>
               <w:rPr>
                 <w:b/>
@@ -751,6 +1951,9 @@
             </w:r>
           </w:p>
           <w:p>
+            <w:pPr>
+              <w:spacing w:before="0" w:after="40"/>
+            </w:pPr>
             <w:r>
               <w:rPr>
                 <w:b/>
@@ -768,22 +1971,76 @@
             </w:r>
           </w:p>
           <w:p>
+            <w:pPr>
+              <w:spacing w:before="0" w:after="0"/>
+              <w:ind w:left="198"/>
+            </w:pPr>
+            <w:r>
+              <w:rPr>
+                <w:color w:val="96794A"/>
+                <w:sz w:val="16"/>
+              </w:rPr>
+              <w:t xml:space="preserve">▪  </w:t>
+            </w:r>
             <w:r>
               <w:rPr>
                 <w:color w:val="4A5568"/>
                 <w:sz w:val="16"/>
               </w:rPr>
-              <w:t>Gestão de encomendas, faturação, contacto com clientes nacionais e internacionais.</w:t>
+              <w:t>Gestão de encomendas e faturação</w:t>
             </w:r>
           </w:p>
           <w:p>
+            <w:pPr>
+              <w:spacing w:before="0" w:after="0"/>
+              <w:ind w:left="198"/>
+            </w:pPr>
+            <w:r>
+              <w:rPr>
+                <w:color w:val="96794A"/>
+                <w:sz w:val="16"/>
+              </w:rPr>
+              <w:t xml:space="preserve">▪  </w:t>
+            </w:r>
+            <w:r>
+              <w:rPr>
+                <w:color w:val="4A5568"/>
+                <w:sz w:val="16"/>
+              </w:rPr>
+              <w:t>Contacto com clientes nacionais e internacionais</w:t>
+            </w:r>
+          </w:p>
+          <w:p>
+            <w:pPr>
+              <w:spacing w:before="0" w:after="0"/>
+              <w:ind w:left="198"/>
+            </w:pPr>
+            <w:r>
+              <w:rPr>
+                <w:color w:val="96794A"/>
+                <w:sz w:val="16"/>
+              </w:rPr>
+              <w:t xml:space="preserve">▪  </w:t>
+            </w:r>
+            <w:r>
+              <w:rPr>
+                <w:color w:val="4A5568"/>
+                <w:sz w:val="16"/>
+              </w:rPr>
+              <w:t>Organização documental numa empresa vitivinícola de referência</w:t>
+            </w:r>
+          </w:p>
+          <w:p>
+            <w:pPr>
+              <w:spacing w:before="100" w:after="0"/>
+            </w:pPr>
             <w:r>
               <w:rPr>
                 <w:b/>
                 <w:color w:val="2D3748"/>
                 <w:sz w:val="18"/>
               </w:rPr>
-              <w:t>Rececionista e Assistente de Back Office</w:t>
+              <w:t>Rececionista de Front Office e Assistente de Back Office</w:t>
             </w:r>
             <w:r>
               <w:rPr>
@@ -801,6 +2058,9 @@
             </w:r>
           </w:p>
           <w:p>
+            <w:pPr>
+              <w:spacing w:before="0" w:after="40"/>
+            </w:pPr>
             <w:r>
               <w:rPr>
                 <w:b/>
@@ -818,22 +2078,76 @@
             </w:r>
           </w:p>
           <w:p>
+            <w:pPr>
+              <w:spacing w:before="0" w:after="0"/>
+              <w:ind w:left="198"/>
+            </w:pPr>
+            <w:r>
+              <w:rPr>
+                <w:color w:val="96794A"/>
+                <w:sz w:val="16"/>
+              </w:rPr>
+              <w:t xml:space="preserve">▪  </w:t>
+            </w:r>
             <w:r>
               <w:rPr>
                 <w:color w:val="4A5568"/>
                 <w:sz w:val="16"/>
               </w:rPr>
-              <w:t>Check-in/check-out, gestão de reservas, faturação hoteleira e apoio administrativo.</w:t>
+              <w:t>Atendimento ao público, check-in e check-out</w:t>
             </w:r>
           </w:p>
           <w:p>
+            <w:pPr>
+              <w:spacing w:before="0" w:after="0"/>
+              <w:ind w:left="198"/>
+            </w:pPr>
+            <w:r>
+              <w:rPr>
+                <w:color w:val="96794A"/>
+                <w:sz w:val="16"/>
+              </w:rPr>
+              <w:t xml:space="preserve">▪  </w:t>
+            </w:r>
+            <w:r>
+              <w:rPr>
+                <w:color w:val="4A5568"/>
+                <w:sz w:val="16"/>
+              </w:rPr>
+              <w:t>Gestão de reservas e faturação hoteleira</w:t>
+            </w:r>
+          </w:p>
+          <w:p>
+            <w:pPr>
+              <w:spacing w:before="0" w:after="0"/>
+              <w:ind w:left="198"/>
+            </w:pPr>
+            <w:r>
+              <w:rPr>
+                <w:color w:val="96794A"/>
+                <w:sz w:val="16"/>
+              </w:rPr>
+              <w:t xml:space="preserve">▪  </w:t>
+            </w:r>
+            <w:r>
+              <w:rPr>
+                <w:color w:val="4A5568"/>
+                <w:sz w:val="16"/>
+              </w:rPr>
+              <w:t>Apoio administrativo de back office</w:t>
+            </w:r>
+          </w:p>
+          <w:p>
+            <w:pPr>
+              <w:spacing w:before="100" w:after="0"/>
+            </w:pPr>
             <w:r>
               <w:rPr>
                 <w:b/>
                 <w:color w:val="2D3748"/>
                 <w:sz w:val="18"/>
               </w:rPr>
-              <w:t>Recepcionista / Gerente Comercial</w:t>
+              <w:t>Rececionista · Gerente Comercial e Reservas</w:t>
             </w:r>
             <w:r>
               <w:rPr>
@@ -851,6 +2165,9 @@
             </w:r>
           </w:p>
           <w:p>
+            <w:pPr>
+              <w:spacing w:before="0" w:after="40"/>
+            </w:pPr>
             <w:r>
               <w:rPr>
                 <w:b/>
@@ -868,6 +2185,49 @@
             </w:r>
           </w:p>
           <w:p>
+            <w:pPr>
+              <w:spacing w:before="0" w:after="0"/>
+              <w:ind w:left="198"/>
+            </w:pPr>
+            <w:r>
+              <w:rPr>
+                <w:color w:val="96794A"/>
+                <w:sz w:val="16"/>
+              </w:rPr>
+              <w:t xml:space="preserve">▪  </w:t>
+            </w:r>
+            <w:r>
+              <w:rPr>
+                <w:color w:val="4A5568"/>
+                <w:sz w:val="16"/>
+              </w:rPr>
+              <w:t>Gestão de reservas e receção de hóspedes</w:t>
+            </w:r>
+          </w:p>
+          <w:p>
+            <w:pPr>
+              <w:spacing w:before="0" w:after="0"/>
+              <w:ind w:left="198"/>
+            </w:pPr>
+            <w:r>
+              <w:rPr>
+                <w:color w:val="96794A"/>
+                <w:sz w:val="16"/>
+              </w:rPr>
+              <w:t xml:space="preserve">▪  </w:t>
+            </w:r>
+            <w:r>
+              <w:rPr>
+                <w:color w:val="4A5568"/>
+                <w:sz w:val="16"/>
+              </w:rPr>
+              <w:t>Apoio comercial e coordenação do departamento de reservas</w:t>
+            </w:r>
+          </w:p>
+          <w:p>
+            <w:pPr>
+              <w:spacing w:before="200" w:after="80"/>
+            </w:pPr>
             <w:r>
               <w:rPr>
                 <w:b/>
@@ -878,6 +2238,9 @@
             </w:r>
           </w:p>
           <w:p>
+            <w:pPr>
+              <w:spacing w:before="0" w:after="120"/>
+            </w:pPr>
             <w:r>
               <w:rPr>
                 <w:color w:val="E2E8F0"/>
@@ -887,6 +2250,9 @@
             </w:r>
           </w:p>
           <w:p>
+            <w:pPr>
+              <w:spacing w:before="80" w:after="0"/>
+            </w:pPr>
             <w:r>
               <w:rPr>
                 <w:b/>
@@ -897,6 +2263,9 @@
             </w:r>
           </w:p>
           <w:p>
+            <w:pPr>
+              <w:spacing w:before="0" w:after="40"/>
+            </w:pPr>
             <w:r>
               <w:rPr>
                 <w:b/>
@@ -914,6 +2283,9 @@
             </w:r>
           </w:p>
           <w:p>
+            <w:pPr>
+              <w:spacing w:before="80" w:after="0"/>
+            </w:pPr>
             <w:r>
               <w:rPr>
                 <w:b/>
@@ -924,6 +2296,9 @@
             </w:r>
           </w:p>
           <w:p>
+            <w:pPr>
+              <w:spacing w:before="0" w:after="40"/>
+            </w:pPr>
             <w:r>
               <w:rPr>
                 <w:b/>
@@ -938,6 +2313,43 @@
                 <w:sz w:val="15"/>
               </w:rPr>
               <w:t xml:space="preserve">  ·  set 2002 - jul 2014</w:t>
+            </w:r>
+          </w:p>
+          <w:p>
+            <w:pPr>
+              <w:spacing w:before="280" w:after="80"/>
+            </w:pPr>
+            <w:r>
+              <w:rPr>
+                <w:color w:val="96794A"/>
+                <w:sz w:val="8"/>
+              </w:rPr>
+              <w:t>━━━━━━━━━━━━━━━━━━━━━━━━━━━━━━━━━━━━━━━━━━━━━━━━━━━━━━━</w:t>
+            </w:r>
+          </w:p>
+          <w:p>
+            <w:pPr>
+              <w:spacing w:before="0" w:after="40"/>
+            </w:pPr>
+            <w:r>
+              <w:rPr>
+                <w:b/>
+                <w:color w:val="2D3748"/>
+                <w:sz w:val="18"/>
+              </w:rPr>
+              <w:t>À procura de uma profissional organizada, responsável e versátil?</w:t>
+            </w:r>
+          </w:p>
+          <w:p>
+            <w:pPr>
+              <w:spacing w:before="0" w:after="0"/>
+            </w:pPr>
+            <w:r>
+              <w:rPr>
+                <w:color w:val="4A5568"/>
+                <w:sz w:val="17"/>
+              </w:rPr>
+              <w:t>Terei todo o gosto em conversar consigo.  ·  verbnii_24@hotmail.com  ·  anaverbnii.me</w:t>
             </w:r>
           </w:p>
         </w:tc>
@@ -1316,6 +2728,9 @@
     <w:name w:val="Normal"/>
     <w:qFormat/>
     <w:rsid w:val="00FC693F"/>
+    <w:pPr>
+      <w:spacing w:after="0"/>
+    </w:pPr>
     <w:rPr>
       <w:rFonts w:ascii="Calibri" w:hAnsi="Calibri"/>
       <w:sz w:val="18"/>

</xml_diff>